<commit_message>
Correção lista de MD
</commit_message>
<xml_diff>
--- a/UNIUBE-MD/Listas/Lista Avaliativa 1 - MD.docx
+++ b/UNIUBE-MD/Listas/Lista Avaliativa 1 - MD.docx
@@ -550,46 +550,7 @@
         <w:jc w:val="both"/>
       </w:pPr>
       <w:r>
-        <w:t>Suponha que o Smartphone A tenha 256 MB de RAM e</w:t>
-      </w:r>
-      <w:r>
-        <w:t xml:space="preserve"> </w:t>
-      </w:r>
-      <w:r>
-        <w:t>32 GB de ROM, e a resolução de sua câmera seja de 8 MP;</w:t>
-      </w:r>
-      <w:r>
-        <w:t xml:space="preserve"> </w:t>
-      </w:r>
-      <w:r>
-        <w:t>o Smartphone B tenha 288 MB de RAM e 64 GB de ROM, e</w:t>
-      </w:r>
-      <w:r>
-        <w:t xml:space="preserve"> </w:t>
-      </w:r>
-      <w:r>
-        <w:t>a resolução de sua câmera seja de 4 MP; e o Smartphone C</w:t>
-      </w:r>
-      <w:r>
-        <w:t xml:space="preserve"> </w:t>
-      </w:r>
-      <w:r>
-        <w:t>tenha 128 MB de RAM e 32 GB de ROM, e a resolução</w:t>
-      </w:r>
-      <w:r>
-        <w:t xml:space="preserve"> </w:t>
-      </w:r>
-      <w:r>
-        <w:t>de sua câmera seja de 5 MP. Determine o valor lógico de cada</w:t>
-      </w:r>
-      <w:r>
-        <w:t xml:space="preserve"> </w:t>
-      </w:r>
-      <w:r>
-        <w:t>uma dessas proposições</w:t>
-      </w:r>
-      <w:r>
-        <w:t>:</w:t>
+        <w:t>Suponha que o Smartphone A tenha 256 MB de RAM e 32 GB de ROM, e a resolução de sua câmera seja de 8 MP; o Smartphone B tenha 288 MB de RAM e 64 GB de ROM, e a resolução de sua câmera seja de 4 MP; e o Smartphone C tenha 128 MB de RAM e 32 GB de ROM, e a resolução de sua câmera seja de 5 MP. Determine o valor lógico de cada uma dessas proposições:</w:t>
       </w:r>
     </w:p>
     <w:p>
@@ -734,65 +695,85 @@
           <w:i/>
           <w:iCs/>
         </w:rPr>
-        <w:t>Quixote</w:t>
+        <w:t>Quixote Media</w:t>
+      </w:r>
+      <w:r>
+        <w:t>, de 111 bilhões de dólares e seu lucro líquido,</w:t>
+      </w:r>
+      <w:r>
+        <w:t xml:space="preserve"> </w:t>
+      </w:r>
+      <w:r>
+        <w:t>de 13 bilhões de dólares. Determine o valor lógico de cada uma</w:t>
+      </w:r>
+      <w:r>
+        <w:t xml:space="preserve"> </w:t>
+      </w:r>
+      <w:r>
+        <w:t>dessas proposições para o ano fiscal mais recente.</w:t>
+      </w:r>
+    </w:p>
+    <w:p>
+      <w:pPr>
+        <w:pStyle w:val="PargrafodaLista"/>
+        <w:spacing w:after="0"/>
+        <w:ind w:left="1440"/>
+        <w:jc w:val="both"/>
+      </w:pPr>
+    </w:p>
+    <w:p>
+      <w:pPr>
+        <w:pStyle w:val="PargrafodaLista"/>
+        <w:numPr>
+          <w:ilvl w:val="1"/>
+          <w:numId w:val="10"/>
+        </w:numPr>
+        <w:spacing w:after="0"/>
+        <w:jc w:val="both"/>
+      </w:pPr>
+      <w:r>
+        <w:t xml:space="preserve">A </w:t>
       </w:r>
       <w:r>
         <w:rPr>
           <w:i/>
           <w:iCs/>
         </w:rPr>
-        <w:t xml:space="preserve"> </w:t>
+        <w:t>Quixote Media</w:t>
+      </w:r>
+      <w:r>
+        <w:t xml:space="preserve"> teve a maior receita anual.</w:t>
+      </w:r>
+    </w:p>
+    <w:p>
+      <w:pPr>
+        <w:pStyle w:val="PargrafodaLista"/>
+        <w:numPr>
+          <w:ilvl w:val="1"/>
+          <w:numId w:val="10"/>
+        </w:numPr>
+        <w:spacing w:after="0"/>
+        <w:jc w:val="both"/>
+      </w:pPr>
+      <w:r>
+        <w:t xml:space="preserve">A </w:t>
       </w:r>
       <w:r>
         <w:rPr>
           <w:i/>
           <w:iCs/>
         </w:rPr>
-        <w:t>Media</w:t>
-      </w:r>
-      <w:r>
-        <w:t>, de 111 bilhões de dólares e seu lucro líquido,</w:t>
-      </w:r>
-      <w:r>
-        <w:t xml:space="preserve"> </w:t>
-      </w:r>
-      <w:r>
-        <w:t>de 13 bilhões de dólares. Determine o valor lógico de cada uma</w:t>
-      </w:r>
-      <w:r>
-        <w:t xml:space="preserve"> </w:t>
-      </w:r>
-      <w:r>
-        <w:t>dessas proposições para o ano fiscal mais recente.</w:t>
-      </w:r>
-    </w:p>
-    <w:p>
-      <w:pPr>
-        <w:pStyle w:val="PargrafodaLista"/>
-        <w:spacing w:after="0"/>
-        <w:ind w:left="1440"/>
-        <w:jc w:val="both"/>
-      </w:pPr>
-    </w:p>
-    <w:p>
-      <w:pPr>
-        <w:pStyle w:val="PargrafodaLista"/>
-        <w:numPr>
-          <w:ilvl w:val="1"/>
-          <w:numId w:val="10"/>
-        </w:numPr>
-        <w:spacing w:after="0"/>
-        <w:jc w:val="both"/>
-      </w:pPr>
-      <w:r>
-        <w:t xml:space="preserve">A </w:t>
+        <w:t>Nadir Software</w:t>
+      </w:r>
+      <w:r>
+        <w:t xml:space="preserve"> teve o menor lucro líquido e a </w:t>
       </w:r>
       <w:r>
         <w:rPr>
           <w:i/>
           <w:iCs/>
         </w:rPr>
-        <w:t>Quixote Media</w:t>
+        <w:t>Acme Computer</w:t>
       </w:r>
       <w:r>
         <w:t xml:space="preserve"> teve a maior receita anual.</w:t>
@@ -816,79 +797,17 @@
           <w:i/>
           <w:iCs/>
         </w:rPr>
-        <w:t>Nadir Software</w:t>
-      </w:r>
-      <w:r>
-        <w:t xml:space="preserve"> teve o menor lucro líquido e a </w:t>
+        <w:t>Acme Computer</w:t>
+      </w:r>
+      <w:r>
+        <w:t xml:space="preserve"> teve o maior lucro líquido ou a </w:t>
       </w:r>
       <w:r>
         <w:rPr>
           <w:i/>
           <w:iCs/>
         </w:rPr>
-        <w:t>Acme</w:t>
-      </w:r>
-      <w:r>
-        <w:rPr>
-          <w:i/>
-          <w:iCs/>
-        </w:rPr>
-        <w:t xml:space="preserve"> </w:t>
-      </w:r>
-      <w:r>
-        <w:rPr>
-          <w:i/>
-          <w:iCs/>
-        </w:rPr>
-        <w:t>Computer</w:t>
-      </w:r>
-      <w:r>
-        <w:t xml:space="preserve"> teve a maior receita anual.</w:t>
-      </w:r>
-    </w:p>
-    <w:p>
-      <w:pPr>
-        <w:pStyle w:val="PargrafodaLista"/>
-        <w:numPr>
-          <w:ilvl w:val="1"/>
-          <w:numId w:val="10"/>
-        </w:numPr>
-        <w:spacing w:after="0"/>
-        <w:jc w:val="both"/>
-      </w:pPr>
-      <w:r>
-        <w:t xml:space="preserve">A </w:t>
-      </w:r>
-      <w:r>
-        <w:rPr>
-          <w:i/>
-          <w:iCs/>
-        </w:rPr>
-        <w:t>Acme Computer</w:t>
-      </w:r>
-      <w:r>
-        <w:t xml:space="preserve"> teve o maior lucro líquido ou a </w:t>
-      </w:r>
-      <w:r>
-        <w:rPr>
-          <w:i/>
-          <w:iCs/>
-        </w:rPr>
-        <w:t>Quixote</w:t>
-      </w:r>
-      <w:r>
-        <w:rPr>
-          <w:i/>
-          <w:iCs/>
-        </w:rPr>
-        <w:t xml:space="preserve"> </w:t>
-      </w:r>
-      <w:r>
-        <w:rPr>
-          <w:i/>
-          <w:iCs/>
-        </w:rPr>
-        <w:t>Media</w:t>
+        <w:t>Quixote Media</w:t>
       </w:r>
       <w:r>
         <w:t xml:space="preserve"> teve o maior lucro líquido.</w:t>
@@ -1441,13 +1360,7 @@
         <w:jc w:val="both"/>
       </w:pPr>
       <w:r>
-        <w:t>Você tira nota A nesta disciplina, mas não faz todos os</w:t>
-      </w:r>
-      <w:r>
-        <w:t xml:space="preserve"> </w:t>
-      </w:r>
-      <w:r>
-        <w:t>exercícios deste livro.</w:t>
+        <w:t>Você tira nota A nesta disciplina, mas não faz todos os exercícios deste livro.</w:t>
       </w:r>
     </w:p>
     <w:p>
@@ -1581,10 +1494,125 @@
       </w:pPr>
       <w:r>
         <w:lastRenderedPageBreak/>
-        <w:t>Para cada uma destas frases, determine se o "ou" empregado é inclusivo ou exclusivo. E</w:t>
-      </w:r>
-      <w:r>
-        <w:t>screva uma explicação, diferenciando os dois tipos de disjunção</w:t>
+        <w:t>Para cada uma destas frases, determine se o "ou" empregado é inclusivo ou exclusivo. Escreva uma explicação, diferenciando os dois tipos de disjunção.</w:t>
+      </w:r>
+    </w:p>
+    <w:p>
+      <w:pPr>
+        <w:pStyle w:val="PargrafodaLista"/>
+        <w:spacing w:after="0"/>
+        <w:jc w:val="both"/>
+      </w:pPr>
+    </w:p>
+    <w:p>
+      <w:pPr>
+        <w:pStyle w:val="PargrafodaLista"/>
+        <w:numPr>
+          <w:ilvl w:val="1"/>
+          <w:numId w:val="10"/>
+        </w:numPr>
+        <w:spacing w:after="0"/>
+        <w:jc w:val="both"/>
+      </w:pPr>
+      <w:r>
+        <w:t>Exige-se experiência com C++ ou Java.</w:t>
+      </w:r>
+    </w:p>
+    <w:p>
+      <w:pPr>
+        <w:pStyle w:val="PargrafodaLista"/>
+        <w:numPr>
+          <w:ilvl w:val="1"/>
+          <w:numId w:val="10"/>
+        </w:numPr>
+        <w:spacing w:after="0"/>
+        <w:jc w:val="both"/>
+      </w:pPr>
+      <w:r>
+        <w:t>O almoço inclui sopa ou salada.</w:t>
+      </w:r>
+    </w:p>
+    <w:p>
+      <w:pPr>
+        <w:pStyle w:val="PargrafodaLista"/>
+        <w:numPr>
+          <w:ilvl w:val="1"/>
+          <w:numId w:val="10"/>
+        </w:numPr>
+        <w:spacing w:after="0"/>
+        <w:jc w:val="both"/>
+      </w:pPr>
+      <w:r>
+        <w:t>Para entrar no país, você precisa de um passaporte ou de um título de eleitor.</w:t>
+      </w:r>
+    </w:p>
+    <w:p>
+      <w:pPr>
+        <w:pStyle w:val="PargrafodaLista"/>
+        <w:numPr>
+          <w:ilvl w:val="1"/>
+          <w:numId w:val="10"/>
+        </w:numPr>
+        <w:spacing w:after="0"/>
+        <w:jc w:val="both"/>
+      </w:pPr>
+      <w:r>
+        <w:t>Para cursar matemática discreta, você deve ter cursado cálculo ou uma disciplina de ciência da computação.</w:t>
+      </w:r>
+    </w:p>
+    <w:p>
+      <w:pPr>
+        <w:pStyle w:val="PargrafodaLista"/>
+        <w:numPr>
+          <w:ilvl w:val="1"/>
+          <w:numId w:val="10"/>
+        </w:numPr>
+        <w:spacing w:after="0"/>
+        <w:jc w:val="both"/>
+      </w:pPr>
+      <w:r>
+        <w:t>Ao comprar um carro novo, você recebe US$ 2.000 de volta em dinheiro ou um financiamento com taxa de 2%.</w:t>
+      </w:r>
+    </w:p>
+    <w:p>
+      <w:pPr>
+        <w:pStyle w:val="PargrafodaLista"/>
+        <w:numPr>
+          <w:ilvl w:val="1"/>
+          <w:numId w:val="10"/>
+        </w:numPr>
+        <w:spacing w:after="0"/>
+        <w:jc w:val="both"/>
+      </w:pPr>
+      <w:r>
+        <w:t>O jantar para duas pessoas inclui dois itens da coluna A ou três itens da coluna B.</w:t>
+      </w:r>
+    </w:p>
+    <w:p>
+      <w:pPr>
+        <w:pStyle w:val="PargrafodaLista"/>
+        <w:spacing w:after="0"/>
+        <w:jc w:val="both"/>
+      </w:pPr>
+    </w:p>
+    <w:p>
+      <w:pPr>
+        <w:pStyle w:val="PargrafodaLista"/>
+        <w:numPr>
+          <w:ilvl w:val="0"/>
+          <w:numId w:val="10"/>
+        </w:numPr>
+        <w:spacing w:after="0"/>
+        <w:jc w:val="both"/>
+      </w:pPr>
+      <w:r>
+        <w:t>Construa uma tabela verdade para cada uma destas proposições compostas</w:t>
+      </w:r>
+      <w:r>
+        <w:t xml:space="preserve">. Diga se é tautologia, contradição ou </w:t>
+      </w:r>
+      <w:r>
+        <w:t>contingência</w:t>
       </w:r>
       <w:r>
         <w:t>.</w:t>
@@ -1594,6 +1622,7 @@
       <w:pPr>
         <w:pStyle w:val="PargrafodaLista"/>
         <w:spacing w:after="0"/>
+        <w:ind w:left="1440"/>
         <w:jc w:val="both"/>
       </w:pPr>
     </w:p>
@@ -1608,7 +1637,34 @@
         <w:jc w:val="both"/>
       </w:pPr>
       <w:r>
-        <w:t>Exige-se experiência com C++ ou Java.</w:t>
+        <w:t xml:space="preserve">(p </w:t>
+      </w:r>
+      <w:r>
+        <w:rPr>
+          <w:rFonts w:ascii="Cambria Math" w:hAnsi="Cambria Math" w:cs="Cambria Math"/>
+        </w:rPr>
+        <w:t>∨</w:t>
+      </w:r>
+      <w:r>
+        <w:t xml:space="preserve"> </w:t>
+      </w:r>
+      <w:r>
+        <w:rPr>
+          <w:rFonts w:ascii="Calibri" w:hAnsi="Calibri" w:cs="Calibri"/>
+        </w:rPr>
+        <w:t>¬</w:t>
+      </w:r>
+      <w:r>
+        <w:t xml:space="preserve">q) </w:t>
+      </w:r>
+      <w:r>
+        <w:rPr>
+          <w:rFonts w:ascii="Calibri" w:hAnsi="Calibri" w:cs="Calibri"/>
+        </w:rPr>
+        <w:t>→</w:t>
+      </w:r>
+      <w:r>
+        <w:t xml:space="preserve"> q </w:t>
       </w:r>
     </w:p>
     <w:p>
@@ -1622,7 +1678,34 @@
         <w:jc w:val="both"/>
       </w:pPr>
       <w:r>
-        <w:t>O almoço inclui sopa ou salada.</w:t>
+        <w:t xml:space="preserve">(p </w:t>
+      </w:r>
+      <w:r>
+        <w:rPr>
+          <w:rFonts w:ascii="Cambria Math" w:hAnsi="Cambria Math" w:cs="Cambria Math"/>
+        </w:rPr>
+        <w:t>∨</w:t>
+      </w:r>
+      <w:r>
+        <w:t xml:space="preserve"> q) </w:t>
+      </w:r>
+      <w:r>
+        <w:rPr>
+          <w:rFonts w:ascii="Calibri" w:hAnsi="Calibri" w:cs="Calibri"/>
+        </w:rPr>
+        <w:t>→</w:t>
+      </w:r>
+      <w:r>
+        <w:t xml:space="preserve"> (p </w:t>
+      </w:r>
+      <w:r>
+        <w:rPr>
+          <w:rFonts w:ascii="Cambria Math" w:hAnsi="Cambria Math" w:cs="Cambria Math"/>
+        </w:rPr>
+        <w:t>∧</w:t>
+      </w:r>
+      <w:r>
+        <w:t xml:space="preserve"> q)</w:t>
       </w:r>
     </w:p>
     <w:p>
@@ -1636,7 +1719,7 @@
         <w:jc w:val="both"/>
       </w:pPr>
       <w:r>
-        <w:t>Para entrar no país, você precisa de um passaporte ou de um título de eleitor.</w:t>
+        <w:t>(p → q) ↔ (¬q → ¬p)</w:t>
       </w:r>
     </w:p>
     <w:p>
@@ -1650,13 +1733,130 @@
         <w:jc w:val="both"/>
       </w:pPr>
       <w:r>
-        <w:t>Para cursar matemática discreta, você deve ter cursado</w:t>
+        <w:t>(p → q) → (q → p)</w:t>
+      </w:r>
+    </w:p>
+    <w:p>
+      <w:pPr>
+        <w:pStyle w:val="PargrafodaLista"/>
+        <w:numPr>
+          <w:ilvl w:val="1"/>
+          <w:numId w:val="10"/>
+        </w:numPr>
+        <w:spacing w:after="0"/>
+        <w:jc w:val="both"/>
+      </w:pPr>
+      <w:r>
+        <w:t xml:space="preserve">p </w:t>
+      </w:r>
+      <w:r>
+        <w:rPr>
+          <w:rFonts w:ascii="Cambria Math" w:hAnsi="Cambria Math" w:cs="Cambria Math"/>
+        </w:rPr>
+        <w:t>⊕</w:t>
+      </w:r>
+      <w:r>
+        <w:t xml:space="preserve"> (p </w:t>
+      </w:r>
+      <w:r>
+        <w:rPr>
+          <w:rFonts w:ascii="Cambria Math" w:hAnsi="Cambria Math" w:cs="Cambria Math"/>
+        </w:rPr>
+        <w:t>∨</w:t>
+      </w:r>
+      <w:r>
+        <w:t xml:space="preserve"> q) </w:t>
+      </w:r>
+    </w:p>
+    <w:p>
+      <w:pPr>
+        <w:pStyle w:val="PargrafodaLista"/>
+        <w:numPr>
+          <w:ilvl w:val="1"/>
+          <w:numId w:val="10"/>
+        </w:numPr>
+        <w:spacing w:after="0"/>
+        <w:jc w:val="both"/>
+      </w:pPr>
+      <w:r>
+        <w:t xml:space="preserve">(p </w:t>
+      </w:r>
+      <w:r>
+        <w:rPr>
+          <w:rFonts w:ascii="Cambria Math" w:hAnsi="Cambria Math" w:cs="Cambria Math"/>
+        </w:rPr>
+        <w:t>∧</w:t>
+      </w:r>
+      <w:r>
+        <w:t xml:space="preserve"> q) </w:t>
+      </w:r>
+      <w:r>
+        <w:rPr>
+          <w:rFonts w:ascii="Calibri" w:hAnsi="Calibri" w:cs="Calibri"/>
+        </w:rPr>
+        <w:t>→</w:t>
+      </w:r>
+      <w:r>
+        <w:t xml:space="preserve"> (p </w:t>
+      </w:r>
+      <w:r>
+        <w:rPr>
+          <w:rFonts w:ascii="Cambria Math" w:hAnsi="Cambria Math" w:cs="Cambria Math"/>
+        </w:rPr>
+        <w:t>∨</w:t>
+      </w:r>
+      <w:r>
+        <w:t xml:space="preserve"> q) </w:t>
+      </w:r>
+    </w:p>
+    <w:p>
+      <w:pPr>
+        <w:pStyle w:val="PargrafodaLista"/>
+        <w:numPr>
+          <w:ilvl w:val="1"/>
+          <w:numId w:val="10"/>
+        </w:numPr>
+        <w:spacing w:after="0"/>
+        <w:jc w:val="both"/>
+      </w:pPr>
+      <w:r>
+        <w:t xml:space="preserve">(q </w:t>
+      </w:r>
+      <w:r>
+        <w:rPr>
+          <w:rFonts w:ascii="Calibri" w:hAnsi="Calibri" w:cs="Calibri"/>
+        </w:rPr>
+        <w:t>→</w:t>
       </w:r>
       <w:r>
         <w:t xml:space="preserve"> </w:t>
       </w:r>
       <w:r>
-        <w:t>cálculo ou uma disciplina de ciência da computação.</w:t>
+        <w:rPr>
+          <w:rFonts w:ascii="Calibri" w:hAnsi="Calibri" w:cs="Calibri"/>
+        </w:rPr>
+        <w:t>¬</w:t>
+      </w:r>
+      <w:r>
+        <w:t xml:space="preserve">p) </w:t>
+      </w:r>
+      <w:r>
+        <w:rPr>
+          <w:rFonts w:ascii="Calibri" w:hAnsi="Calibri" w:cs="Calibri"/>
+        </w:rPr>
+        <w:t>↔</w:t>
+      </w:r>
+      <w:r>
+        <w:t xml:space="preserve"> (p </w:t>
+      </w:r>
+      <w:r>
+        <w:rPr>
+          <w:rFonts w:ascii="Calibri" w:hAnsi="Calibri" w:cs="Calibri"/>
+        </w:rPr>
+        <w:t>↔</w:t>
+      </w:r>
+      <w:r>
+        <w:t xml:space="preserve"> q) </w:t>
       </w:r>
     </w:p>
     <w:p>
@@ -1670,13 +1870,43 @@
         <w:jc w:val="both"/>
       </w:pPr>
       <w:r>
-        <w:t>Ao comprar um carro novo,</w:t>
+        <w:t xml:space="preserve">(p </w:t>
+      </w:r>
+      <w:r>
+        <w:rPr>
+          <w:rFonts w:ascii="Calibri" w:hAnsi="Calibri" w:cs="Calibri"/>
+        </w:rPr>
+        <w:t>↔</w:t>
+      </w:r>
+      <w:r>
+        <w:t xml:space="preserve"> q) </w:t>
+      </w:r>
+      <w:r>
+        <w:rPr>
+          <w:rFonts w:ascii="Cambria Math" w:hAnsi="Cambria Math" w:cs="Cambria Math"/>
+        </w:rPr>
+        <w:t>⊕</w:t>
+      </w:r>
+      <w:r>
+        <w:t xml:space="preserve"> (p </w:t>
+      </w:r>
+      <w:r>
+        <w:rPr>
+          <w:rFonts w:ascii="Calibri" w:hAnsi="Calibri" w:cs="Calibri"/>
+        </w:rPr>
+        <w:t>↔</w:t>
       </w:r>
       <w:r>
         <w:t xml:space="preserve"> </w:t>
       </w:r>
       <w:r>
-        <w:t>você recebe US$ 2.000 de volta em dinheiro ou um financiamento com taxa de 2%.</w:t>
+        <w:rPr>
+          <w:rFonts w:ascii="Calibri" w:hAnsi="Calibri" w:cs="Calibri"/>
+        </w:rPr>
+        <w:t>¬</w:t>
+      </w:r>
+      <w:r>
+        <w:t>q)</w:t>
       </w:r>
     </w:p>
     <w:p>
@@ -1690,52 +1920,262 @@
         <w:jc w:val="both"/>
       </w:pPr>
       <w:r>
-        <w:t>O jantar para duas pessoas inclui dois itens da coluna A ou</w:t>
+        <w:t xml:space="preserve"> ((p → q) → r) → s</w:t>
+      </w:r>
+    </w:p>
+    <w:p>
+      <w:pPr>
+        <w:pStyle w:val="PargrafodaLista"/>
+        <w:numPr>
+          <w:ilvl w:val="1"/>
+          <w:numId w:val="10"/>
+        </w:numPr>
+        <w:spacing w:after="0"/>
+        <w:jc w:val="both"/>
+      </w:pPr>
+      <w:r>
+        <w:t xml:space="preserve"> (p ↔ q) ↔ (r ↔ s)</w:t>
+      </w:r>
+    </w:p>
+    <w:p>
+      <w:pPr>
+        <w:pStyle w:val="PargrafodaLista"/>
+        <w:spacing w:after="0"/>
+        <w:ind w:left="1440"/>
+        <w:jc w:val="both"/>
+      </w:pPr>
+    </w:p>
+    <w:p>
+      <w:pPr>
+        <w:pStyle w:val="PargrafodaLista"/>
+        <w:numPr>
+          <w:ilvl w:val="0"/>
+          <w:numId w:val="10"/>
+        </w:numPr>
+        <w:spacing w:after="0"/>
+        <w:jc w:val="both"/>
+      </w:pPr>
+      <w:r>
+        <w:t xml:space="preserve">Determine as operações OR, AND e XOR bit a bit </w:t>
+      </w:r>
+      <w:r>
+        <w:t>para</w:t>
+      </w:r>
+      <w:r>
+        <w:t xml:space="preserve"> cada um d</w:t>
+      </w:r>
+      <w:r>
+        <w:t>os</w:t>
+      </w:r>
+      <w:r>
+        <w:t xml:space="preserve"> pares</w:t>
+      </w:r>
+    </w:p>
+    <w:p>
+      <w:pPr>
+        <w:pStyle w:val="PargrafodaLista"/>
+        <w:spacing w:after="0"/>
+        <w:jc w:val="both"/>
+      </w:pPr>
+    </w:p>
+    <w:p>
+      <w:pPr>
+        <w:pStyle w:val="PargrafodaLista"/>
+        <w:numPr>
+          <w:ilvl w:val="1"/>
+          <w:numId w:val="10"/>
+        </w:numPr>
+        <w:spacing w:after="0"/>
+        <w:jc w:val="both"/>
+      </w:pPr>
+      <w:r>
+        <w:t>101 1110, 010 0001</w:t>
+      </w:r>
+    </w:p>
+    <w:p>
+      <w:pPr>
+        <w:pStyle w:val="PargrafodaLista"/>
+        <w:numPr>
+          <w:ilvl w:val="1"/>
+          <w:numId w:val="10"/>
+        </w:numPr>
+        <w:spacing w:after="0"/>
+        <w:jc w:val="both"/>
+      </w:pPr>
+      <w:r>
+        <w:t>1111 0000, 1010 1010</w:t>
+      </w:r>
+    </w:p>
+    <w:p>
+      <w:pPr>
+        <w:pStyle w:val="PargrafodaLista"/>
+        <w:numPr>
+          <w:ilvl w:val="1"/>
+          <w:numId w:val="10"/>
+        </w:numPr>
+        <w:spacing w:after="0"/>
+        <w:jc w:val="both"/>
+      </w:pPr>
+      <w:r>
+        <w:t>00 0111 0001, 10 0100 1000</w:t>
+      </w:r>
+    </w:p>
+    <w:p>
+      <w:pPr>
+        <w:pStyle w:val="PargrafodaLista"/>
+        <w:numPr>
+          <w:ilvl w:val="1"/>
+          <w:numId w:val="10"/>
+        </w:numPr>
+        <w:spacing w:after="0"/>
+        <w:jc w:val="both"/>
+      </w:pPr>
+      <w:r>
+        <w:t>11 1111 1111, 00 0000 0000</w:t>
+      </w:r>
+    </w:p>
+    <w:p>
+      <w:pPr>
+        <w:pStyle w:val="PargrafodaLista"/>
+        <w:spacing w:after="0"/>
+        <w:jc w:val="both"/>
+      </w:pPr>
+    </w:p>
+    <w:p>
+      <w:pPr>
+        <w:pStyle w:val="PargrafodaLista"/>
+        <w:numPr>
+          <w:ilvl w:val="0"/>
+          <w:numId w:val="10"/>
+        </w:numPr>
+        <w:spacing w:after="0"/>
+        <w:jc w:val="both"/>
+      </w:pPr>
+      <w:r>
+        <w:t xml:space="preserve">Descreva qual a diferença da lógica proposicional clássica com a álgebra booleana e destaque </w:t>
+      </w:r>
+      <w:r>
+        <w:t xml:space="preserve">como </w:t>
+      </w:r>
+      <w:r>
+        <w:t>os operadores lógicos são representados na álgebra booleana</w:t>
+      </w:r>
+      <w:r>
+        <w:t>.</w:t>
+      </w:r>
+    </w:p>
+    <w:p>
+      <w:pPr>
+        <w:pStyle w:val="PargrafodaLista"/>
+        <w:spacing w:after="0"/>
+        <w:jc w:val="both"/>
+      </w:pPr>
+    </w:p>
+    <w:p>
+      <w:pPr>
+        <w:pStyle w:val="PargrafodaLista"/>
+        <w:numPr>
+          <w:ilvl w:val="0"/>
+          <w:numId w:val="10"/>
+        </w:numPr>
+        <w:spacing w:after="0"/>
+        <w:jc w:val="both"/>
+      </w:pPr>
+      <w:r>
+        <w:t>Mostre que ¬(¬p) e p são logicamente equivalentes por meio da tabela verdade.</w:t>
+      </w:r>
+    </w:p>
+    <w:p>
+      <w:pPr>
+        <w:spacing w:after="0"/>
+        <w:jc w:val="both"/>
+      </w:pPr>
+    </w:p>
+    <w:p>
+      <w:pPr>
+        <w:pStyle w:val="PargrafodaLista"/>
+        <w:numPr>
+          <w:ilvl w:val="0"/>
+          <w:numId w:val="10"/>
+        </w:numPr>
+        <w:spacing w:after="0"/>
+        <w:jc w:val="both"/>
+      </w:pPr>
+      <w:r>
+        <w:t xml:space="preserve">Use tabelas-verdade para verificar as </w:t>
+      </w:r>
+      <w:r>
+        <w:t>seguintes equivalências lógicas:</w:t>
+      </w:r>
+    </w:p>
+    <w:p>
+      <w:pPr>
+        <w:pStyle w:val="PargrafodaLista"/>
+        <w:spacing w:after="0"/>
+        <w:jc w:val="both"/>
+      </w:pPr>
+    </w:p>
+    <w:p>
+      <w:pPr>
+        <w:pStyle w:val="PargrafodaLista"/>
+        <w:numPr>
+          <w:ilvl w:val="1"/>
+          <w:numId w:val="10"/>
+        </w:numPr>
+        <w:spacing w:after="0"/>
+        <w:jc w:val="both"/>
+      </w:pPr>
+      <w:r>
+        <w:t>A</w:t>
+      </w:r>
+      <w:r>
+        <w:t xml:space="preserve"> (</w:t>
+      </w:r>
+      <w:r>
+        <w:t>B</w:t>
       </w:r>
       <w:r>
         <w:t xml:space="preserve"> </w:t>
       </w:r>
       <w:r>
-        <w:t>três itens da coluna B.</w:t>
-      </w:r>
-    </w:p>
-    <w:p>
-      <w:pPr>
-        <w:pStyle w:val="PargrafodaLista"/>
-        <w:spacing w:after="0"/>
-        <w:jc w:val="both"/>
-      </w:pPr>
-    </w:p>
-    <w:p>
-      <w:pPr>
-        <w:pStyle w:val="PargrafodaLista"/>
-        <w:numPr>
-          <w:ilvl w:val="0"/>
-          <w:numId w:val="10"/>
-        </w:numPr>
-        <w:spacing w:after="0"/>
-        <w:jc w:val="both"/>
-      </w:pPr>
-      <w:r>
-        <w:t>Construa uma tabela verdade para cada uma destas proposições compostas</w:t>
-      </w:r>
-      <w:r>
-        <w:t xml:space="preserve">. Diga se é tautologia, contradição ou </w:t>
-      </w:r>
-      <w:r>
-        <w:t>contingência</w:t>
-      </w:r>
-      <w:r>
-        <w:t>.</w:t>
-      </w:r>
-    </w:p>
-    <w:p>
-      <w:pPr>
-        <w:pStyle w:val="PargrafodaLista"/>
-        <w:spacing w:after="0"/>
-        <w:ind w:left="1440"/>
-        <w:jc w:val="both"/>
-      </w:pPr>
+        <w:rPr>
+          <w:rFonts w:ascii="Cambria Math" w:hAnsi="Cambria Math" w:cs="Cambria Math"/>
+        </w:rPr>
+        <w:t>+ C</w:t>
+      </w:r>
+      <w:r>
+        <w:t xml:space="preserve">) </w:t>
+      </w:r>
+      <w:r>
+        <w:rPr>
+          <w:rFonts w:ascii="Calibri" w:hAnsi="Calibri" w:cs="Calibri"/>
+        </w:rPr>
+        <w:t>≡</w:t>
+      </w:r>
+      <w:r>
+        <w:t xml:space="preserve"> (</w:t>
+      </w:r>
+      <w:r>
+        <w:t>AB</w:t>
+      </w:r>
+      <w:r>
+        <w:t xml:space="preserve">) </w:t>
+      </w:r>
+      <w:r>
+        <w:rPr>
+          <w:rFonts w:ascii="Cambria Math" w:hAnsi="Cambria Math" w:cs="Cambria Math"/>
+        </w:rPr>
+        <w:t>+</w:t>
+      </w:r>
+      <w:r>
+        <w:t xml:space="preserve"> (</w:t>
+      </w:r>
+      <w:r>
+        <w:t>AC</w:t>
+      </w:r>
+      <w:r>
+        <w:t>).</w:t>
+      </w:r>
     </w:p>
     <w:p>
       <w:pPr>
@@ -1748,638 +2188,52 @@
         <w:jc w:val="both"/>
       </w:pPr>
       <w:r>
-        <w:t xml:space="preserve">(p </w:t>
+        <w:t xml:space="preserve">A </w:t>
       </w:r>
       <w:r>
         <w:rPr>
           <w:rFonts w:ascii="Cambria Math" w:hAnsi="Cambria Math" w:cs="Cambria Math"/>
         </w:rPr>
-        <w:t>∨</w:t>
-      </w:r>
-      <w:r>
-        <w:t xml:space="preserve"> </w:t>
+        <w:t>+</w:t>
+      </w:r>
+      <w:r>
+        <w:t xml:space="preserve"> (</w:t>
+      </w:r>
+      <w:r>
+        <w:rPr>
+          <w:rFonts w:ascii="Cambria Math" w:hAnsi="Cambria Math" w:cs="Cambria Math"/>
+        </w:rPr>
+        <w:t>BC</w:t>
+      </w:r>
+      <w:r>
+        <w:t xml:space="preserve">) </w:t>
       </w:r>
       <w:r>
         <w:rPr>
           <w:rFonts w:ascii="Calibri" w:hAnsi="Calibri" w:cs="Calibri"/>
         </w:rPr>
-        <w:t>¬</w:t>
-      </w:r>
-      <w:r>
-        <w:t xml:space="preserve">q) </w:t>
-      </w:r>
-      <w:r>
-        <w:rPr>
-          <w:rFonts w:ascii="Calibri" w:hAnsi="Calibri" w:cs="Calibri"/>
-        </w:rPr>
-        <w:t>→</w:t>
-      </w:r>
-      <w:r>
-        <w:t xml:space="preserve"> q </w:t>
-      </w:r>
-    </w:p>
-    <w:p>
-      <w:pPr>
-        <w:pStyle w:val="PargrafodaLista"/>
-        <w:numPr>
-          <w:ilvl w:val="1"/>
-          <w:numId w:val="10"/>
-        </w:numPr>
-        <w:spacing w:after="0"/>
-        <w:jc w:val="both"/>
-      </w:pPr>
-      <w:r>
-        <w:t xml:space="preserve">(p </w:t>
+        <w:t>≡</w:t>
+      </w:r>
+      <w:r>
+        <w:t xml:space="preserve"> (A </w:t>
       </w:r>
       <w:r>
         <w:rPr>
           <w:rFonts w:ascii="Cambria Math" w:hAnsi="Cambria Math" w:cs="Cambria Math"/>
         </w:rPr>
-        <w:t>∨</w:t>
-      </w:r>
-      <w:r>
-        <w:t xml:space="preserve"> q) </w:t>
-      </w:r>
-      <w:r>
-        <w:rPr>
-          <w:rFonts w:ascii="Calibri" w:hAnsi="Calibri" w:cs="Calibri"/>
-        </w:rPr>
-        <w:t>→</w:t>
-      </w:r>
-      <w:r>
-        <w:t xml:space="preserve"> (p </w:t>
+        <w:t>+</w:t>
+      </w:r>
+      <w:r>
+        <w:t xml:space="preserve"> B)(A </w:t>
       </w:r>
       <w:r>
         <w:rPr>
           <w:rFonts w:ascii="Cambria Math" w:hAnsi="Cambria Math" w:cs="Cambria Math"/>
         </w:rPr>
-        <w:t>∧</w:t>
-      </w:r>
-      <w:r>
-        <w:t xml:space="preserve"> q)</w:t>
-      </w:r>
-    </w:p>
-    <w:p>
-      <w:pPr>
-        <w:pStyle w:val="PargrafodaLista"/>
-        <w:numPr>
-          <w:ilvl w:val="1"/>
-          <w:numId w:val="10"/>
-        </w:numPr>
-        <w:spacing w:after="0"/>
-        <w:jc w:val="both"/>
-      </w:pPr>
-      <w:r>
-        <w:t>(p → q) ↔ (¬q → ¬p)</w:t>
-      </w:r>
-    </w:p>
-    <w:p>
-      <w:pPr>
-        <w:pStyle w:val="PargrafodaLista"/>
-        <w:numPr>
-          <w:ilvl w:val="1"/>
-          <w:numId w:val="10"/>
-        </w:numPr>
-        <w:spacing w:after="0"/>
-        <w:jc w:val="both"/>
-      </w:pPr>
-      <w:r>
-        <w:t>(p → q) → (q → p)</w:t>
-      </w:r>
-    </w:p>
-    <w:p>
-      <w:pPr>
-        <w:pStyle w:val="PargrafodaLista"/>
-        <w:numPr>
-          <w:ilvl w:val="1"/>
-          <w:numId w:val="10"/>
-        </w:numPr>
-        <w:spacing w:after="0"/>
-        <w:jc w:val="both"/>
-      </w:pPr>
-      <w:r>
-        <w:t xml:space="preserve">p </w:t>
-      </w:r>
-      <w:r>
-        <w:rPr>
-          <w:rFonts w:ascii="Cambria Math" w:hAnsi="Cambria Math" w:cs="Cambria Math"/>
-        </w:rPr>
-        <w:t>⊕</w:t>
-      </w:r>
-      <w:r>
-        <w:t xml:space="preserve"> (p </w:t>
-      </w:r>
-      <w:r>
-        <w:rPr>
-          <w:rFonts w:ascii="Cambria Math" w:hAnsi="Cambria Math" w:cs="Cambria Math"/>
-        </w:rPr>
-        <w:t>∨</w:t>
-      </w:r>
-      <w:r>
-        <w:t xml:space="preserve"> q) </w:t>
-      </w:r>
-    </w:p>
-    <w:p>
-      <w:pPr>
-        <w:pStyle w:val="PargrafodaLista"/>
-        <w:numPr>
-          <w:ilvl w:val="1"/>
-          <w:numId w:val="10"/>
-        </w:numPr>
-        <w:spacing w:after="0"/>
-        <w:jc w:val="both"/>
-      </w:pPr>
-      <w:r>
-        <w:t xml:space="preserve">(p </w:t>
-      </w:r>
-      <w:r>
-        <w:rPr>
-          <w:rFonts w:ascii="Cambria Math" w:hAnsi="Cambria Math" w:cs="Cambria Math"/>
-        </w:rPr>
-        <w:t>∧</w:t>
-      </w:r>
-      <w:r>
-        <w:t xml:space="preserve"> q) </w:t>
-      </w:r>
-      <w:r>
-        <w:rPr>
-          <w:rFonts w:ascii="Calibri" w:hAnsi="Calibri" w:cs="Calibri"/>
-        </w:rPr>
-        <w:t>→</w:t>
-      </w:r>
-      <w:r>
-        <w:t xml:space="preserve"> (p </w:t>
-      </w:r>
-      <w:r>
-        <w:rPr>
-          <w:rFonts w:ascii="Cambria Math" w:hAnsi="Cambria Math" w:cs="Cambria Math"/>
-        </w:rPr>
-        <w:t>∨</w:t>
-      </w:r>
-      <w:r>
-        <w:t xml:space="preserve"> q) </w:t>
-      </w:r>
-    </w:p>
-    <w:p>
-      <w:pPr>
-        <w:pStyle w:val="PargrafodaLista"/>
-        <w:numPr>
-          <w:ilvl w:val="1"/>
-          <w:numId w:val="10"/>
-        </w:numPr>
-        <w:spacing w:after="0"/>
-        <w:jc w:val="both"/>
-      </w:pPr>
-      <w:r>
-        <w:t xml:space="preserve">(q </w:t>
-      </w:r>
-      <w:r>
-        <w:rPr>
-          <w:rFonts w:ascii="Calibri" w:hAnsi="Calibri" w:cs="Calibri"/>
-        </w:rPr>
-        <w:t>→</w:t>
-      </w:r>
-      <w:r>
-        <w:t xml:space="preserve"> </w:t>
-      </w:r>
-      <w:r>
-        <w:rPr>
-          <w:rFonts w:ascii="Calibri" w:hAnsi="Calibri" w:cs="Calibri"/>
-        </w:rPr>
-        <w:t>¬</w:t>
-      </w:r>
-      <w:r>
-        <w:t xml:space="preserve">p) </w:t>
-      </w:r>
-      <w:r>
-        <w:rPr>
-          <w:rFonts w:ascii="Calibri" w:hAnsi="Calibri" w:cs="Calibri"/>
-        </w:rPr>
-        <w:t>↔</w:t>
-      </w:r>
-      <w:r>
-        <w:t xml:space="preserve"> (p </w:t>
-      </w:r>
-      <w:r>
-        <w:rPr>
-          <w:rFonts w:ascii="Calibri" w:hAnsi="Calibri" w:cs="Calibri"/>
-        </w:rPr>
-        <w:t>↔</w:t>
-      </w:r>
-      <w:r>
-        <w:t xml:space="preserve"> q) </w:t>
-      </w:r>
-    </w:p>
-    <w:p>
-      <w:pPr>
-        <w:pStyle w:val="PargrafodaLista"/>
-        <w:numPr>
-          <w:ilvl w:val="1"/>
-          <w:numId w:val="10"/>
-        </w:numPr>
-        <w:spacing w:after="0"/>
-        <w:jc w:val="both"/>
-      </w:pPr>
-      <w:r>
-        <w:t xml:space="preserve">(p </w:t>
-      </w:r>
-      <w:r>
-        <w:rPr>
-          <w:rFonts w:ascii="Calibri" w:hAnsi="Calibri" w:cs="Calibri"/>
-        </w:rPr>
-        <w:t>↔</w:t>
-      </w:r>
-      <w:r>
-        <w:t xml:space="preserve"> q) </w:t>
-      </w:r>
-      <w:r>
-        <w:rPr>
-          <w:rFonts w:ascii="Cambria Math" w:hAnsi="Cambria Math" w:cs="Cambria Math"/>
-        </w:rPr>
-        <w:t>⊕</w:t>
-      </w:r>
-      <w:r>
-        <w:t xml:space="preserve"> (p </w:t>
-      </w:r>
-      <w:r>
-        <w:rPr>
-          <w:rFonts w:ascii="Calibri" w:hAnsi="Calibri" w:cs="Calibri"/>
-        </w:rPr>
-        <w:t>↔</w:t>
-      </w:r>
-      <w:r>
-        <w:t xml:space="preserve"> </w:t>
-      </w:r>
-      <w:r>
-        <w:rPr>
-          <w:rFonts w:ascii="Calibri" w:hAnsi="Calibri" w:cs="Calibri"/>
-        </w:rPr>
-        <w:t>¬</w:t>
-      </w:r>
-      <w:r>
-        <w:t>q)</w:t>
-      </w:r>
-    </w:p>
-    <w:p>
-      <w:pPr>
-        <w:pStyle w:val="PargrafodaLista"/>
-        <w:numPr>
-          <w:ilvl w:val="1"/>
-          <w:numId w:val="10"/>
-        </w:numPr>
-        <w:spacing w:after="0"/>
-        <w:jc w:val="both"/>
-      </w:pPr>
-      <w:r>
-        <w:t xml:space="preserve"> ((p → q) → r) → s</w:t>
-      </w:r>
-    </w:p>
-    <w:p>
-      <w:pPr>
-        <w:pStyle w:val="PargrafodaLista"/>
-        <w:numPr>
-          <w:ilvl w:val="1"/>
-          <w:numId w:val="10"/>
-        </w:numPr>
-        <w:spacing w:after="0"/>
-        <w:jc w:val="both"/>
-      </w:pPr>
-      <w:r>
-        <w:t xml:space="preserve"> (p ↔ q) ↔ (r ↔ s)</w:t>
-      </w:r>
-    </w:p>
-    <w:p>
-      <w:pPr>
-        <w:pStyle w:val="PargrafodaLista"/>
-        <w:spacing w:after="0"/>
-        <w:ind w:left="1440"/>
-        <w:jc w:val="both"/>
-      </w:pPr>
-    </w:p>
-    <w:p>
-      <w:pPr>
-        <w:pStyle w:val="PargrafodaLista"/>
-        <w:numPr>
-          <w:ilvl w:val="0"/>
-          <w:numId w:val="10"/>
-        </w:numPr>
-        <w:spacing w:after="0"/>
-        <w:jc w:val="both"/>
-      </w:pPr>
-      <w:r>
-        <w:t xml:space="preserve">Determine as operações OR, AND e XOR bit a bit </w:t>
-      </w:r>
-      <w:r>
-        <w:t>para</w:t>
-      </w:r>
-      <w:r>
-        <w:t xml:space="preserve"> </w:t>
-      </w:r>
-      <w:r>
-        <w:t>cada um d</w:t>
-      </w:r>
-      <w:r>
-        <w:t>os</w:t>
-      </w:r>
-      <w:r>
-        <w:t xml:space="preserve"> pares</w:t>
-      </w:r>
-    </w:p>
-    <w:p>
-      <w:pPr>
-        <w:pStyle w:val="PargrafodaLista"/>
-        <w:spacing w:after="0"/>
-        <w:jc w:val="both"/>
-      </w:pPr>
-    </w:p>
-    <w:p>
-      <w:pPr>
-        <w:pStyle w:val="PargrafodaLista"/>
-        <w:numPr>
-          <w:ilvl w:val="1"/>
-          <w:numId w:val="10"/>
-        </w:numPr>
-        <w:spacing w:after="0"/>
-        <w:jc w:val="both"/>
-      </w:pPr>
-      <w:r>
-        <w:t>101 1110, 010 0001</w:t>
-      </w:r>
-    </w:p>
-    <w:p>
-      <w:pPr>
-        <w:pStyle w:val="PargrafodaLista"/>
-        <w:numPr>
-          <w:ilvl w:val="1"/>
-          <w:numId w:val="10"/>
-        </w:numPr>
-        <w:spacing w:after="0"/>
-        <w:jc w:val="both"/>
-      </w:pPr>
-      <w:r>
-        <w:t>1111 0000, 1010 1010</w:t>
-      </w:r>
-    </w:p>
-    <w:p>
-      <w:pPr>
-        <w:pStyle w:val="PargrafodaLista"/>
-        <w:numPr>
-          <w:ilvl w:val="1"/>
-          <w:numId w:val="10"/>
-        </w:numPr>
-        <w:spacing w:after="0"/>
-        <w:jc w:val="both"/>
-      </w:pPr>
-      <w:r>
-        <w:t>00 0111 0001, 10 0100 1000</w:t>
-      </w:r>
-    </w:p>
-    <w:p>
-      <w:pPr>
-        <w:pStyle w:val="PargrafodaLista"/>
-        <w:numPr>
-          <w:ilvl w:val="1"/>
-          <w:numId w:val="10"/>
-        </w:numPr>
-        <w:spacing w:after="0"/>
-        <w:jc w:val="both"/>
-      </w:pPr>
-      <w:r>
-        <w:t>11 1111 1111, 00 0000 0000</w:t>
-      </w:r>
-    </w:p>
-    <w:p>
-      <w:pPr>
-        <w:pStyle w:val="PargrafodaLista"/>
-        <w:spacing w:after="0"/>
-        <w:jc w:val="both"/>
-      </w:pPr>
-    </w:p>
-    <w:p>
-      <w:pPr>
-        <w:pStyle w:val="PargrafodaLista"/>
-        <w:numPr>
-          <w:ilvl w:val="0"/>
-          <w:numId w:val="10"/>
-        </w:numPr>
-        <w:spacing w:after="0"/>
-        <w:jc w:val="both"/>
-      </w:pPr>
-      <w:r>
-        <w:t xml:space="preserve">Descreva qual a diferença da lógica proposicional clássica com a álgebra booleana e destaque </w:t>
-      </w:r>
-      <w:r>
-        <w:t xml:space="preserve">como </w:t>
-      </w:r>
-      <w:r>
-        <w:t>os operadores lógicos são representados na álgebra booleana</w:t>
-      </w:r>
-      <w:r>
-        <w:t>.</w:t>
-      </w:r>
-    </w:p>
-    <w:p>
-      <w:pPr>
-        <w:pStyle w:val="PargrafodaLista"/>
-        <w:spacing w:after="0"/>
-        <w:jc w:val="both"/>
-      </w:pPr>
-    </w:p>
-    <w:p>
-      <w:pPr>
-        <w:pStyle w:val="PargrafodaLista"/>
-        <w:numPr>
-          <w:ilvl w:val="0"/>
-          <w:numId w:val="10"/>
-        </w:numPr>
-        <w:spacing w:after="0"/>
-        <w:jc w:val="both"/>
-      </w:pPr>
-      <w:r>
-        <w:t>Mostre que ¬(¬p) e p são logicamente equivalentes</w:t>
-      </w:r>
-      <w:r>
-        <w:t xml:space="preserve"> por meio da tabela verdade</w:t>
-      </w:r>
-      <w:r>
-        <w:t>.</w:t>
-      </w:r>
-    </w:p>
-    <w:p>
-      <w:pPr>
-        <w:spacing w:after="0"/>
-        <w:jc w:val="both"/>
-      </w:pPr>
-    </w:p>
-    <w:p>
-      <w:pPr>
-        <w:pStyle w:val="PargrafodaLista"/>
-        <w:numPr>
-          <w:ilvl w:val="0"/>
-          <w:numId w:val="10"/>
-        </w:numPr>
-        <w:spacing w:after="0"/>
-        <w:jc w:val="both"/>
-      </w:pPr>
-      <w:r>
-        <w:t xml:space="preserve">Use tabelas-verdade para verificar as </w:t>
-      </w:r>
-      <w:r>
-        <w:t>seguintes equivalências lógicas:</w:t>
-      </w:r>
-    </w:p>
-    <w:p>
-      <w:pPr>
-        <w:pStyle w:val="PargrafodaLista"/>
-        <w:spacing w:after="0"/>
-        <w:jc w:val="both"/>
-      </w:pPr>
-    </w:p>
-    <w:p>
-      <w:pPr>
-        <w:pStyle w:val="PargrafodaLista"/>
-        <w:numPr>
-          <w:ilvl w:val="1"/>
-          <w:numId w:val="10"/>
-        </w:numPr>
-        <w:spacing w:after="0"/>
-        <w:jc w:val="both"/>
-      </w:pPr>
-      <w:r>
-        <w:t>A</w:t>
-      </w:r>
-      <w:r>
-        <w:t xml:space="preserve"> (</w:t>
-      </w:r>
-      <w:r>
-        <w:t>B</w:t>
-      </w:r>
-      <w:r>
-        <w:t xml:space="preserve"> </w:t>
-      </w:r>
-      <w:r>
-        <w:rPr>
-          <w:rFonts w:ascii="Cambria Math" w:hAnsi="Cambria Math" w:cs="Cambria Math"/>
-        </w:rPr>
-        <w:t>+ C</w:t>
-      </w:r>
-      <w:r>
-        <w:t xml:space="preserve">) </w:t>
-      </w:r>
-      <w:r>
-        <w:rPr>
-          <w:rFonts w:ascii="Calibri" w:hAnsi="Calibri" w:cs="Calibri"/>
-        </w:rPr>
-        <w:t>≡</w:t>
-      </w:r>
-      <w:r>
-        <w:t xml:space="preserve"> (</w:t>
-      </w:r>
-      <w:r>
-        <w:t>AB</w:t>
-      </w:r>
-      <w:r>
-        <w:t xml:space="preserve">) </w:t>
-      </w:r>
-      <w:r>
-        <w:rPr>
-          <w:rFonts w:ascii="Cambria Math" w:hAnsi="Cambria Math" w:cs="Cambria Math"/>
-        </w:rPr>
         <w:t>+</w:t>
       </w:r>
       <w:r>
-        <w:t xml:space="preserve"> (</w:t>
-      </w:r>
-      <w:r>
-        <w:t>AC</w:t>
-      </w:r>
-      <w:r>
-        <w:t>).</w:t>
-      </w:r>
-    </w:p>
-    <w:p>
-      <w:pPr>
-        <w:pStyle w:val="PargrafodaLista"/>
-        <w:numPr>
-          <w:ilvl w:val="1"/>
-          <w:numId w:val="10"/>
-        </w:numPr>
-        <w:spacing w:after="0"/>
-        <w:jc w:val="both"/>
-      </w:pPr>
-      <w:r>
-        <w:t>A</w:t>
-      </w:r>
-      <w:r>
-        <w:t xml:space="preserve"> </w:t>
-      </w:r>
-      <w:r>
-        <w:rPr>
-          <w:rFonts w:ascii="Cambria Math" w:hAnsi="Cambria Math" w:cs="Cambria Math"/>
-        </w:rPr>
-        <w:t>+</w:t>
-      </w:r>
-      <w:r>
-        <w:t xml:space="preserve"> </w:t>
-      </w:r>
-      <w:r>
-        <w:t>(</w:t>
-      </w:r>
-      <w:r>
-        <w:rPr>
-          <w:rFonts w:ascii="Cambria Math" w:hAnsi="Cambria Math" w:cs="Cambria Math"/>
-        </w:rPr>
-        <w:t>BC</w:t>
-      </w:r>
-      <w:r>
-        <w:t xml:space="preserve">) </w:t>
-      </w:r>
-      <w:r>
-        <w:rPr>
-          <w:rFonts w:ascii="Calibri" w:hAnsi="Calibri" w:cs="Calibri"/>
-        </w:rPr>
-        <w:t>≡</w:t>
-      </w:r>
-      <w:r>
-        <w:t xml:space="preserve"> (</w:t>
-      </w:r>
-      <w:r>
-        <w:t xml:space="preserve">A </w:t>
-      </w:r>
-      <w:r>
-        <w:rPr>
-          <w:rFonts w:ascii="Cambria Math" w:hAnsi="Cambria Math" w:cs="Cambria Math"/>
-        </w:rPr>
-        <w:t>+</w:t>
-      </w:r>
-      <w:r>
-        <w:t xml:space="preserve"> </w:t>
-      </w:r>
-      <w:proofErr w:type="gramStart"/>
-      <w:r>
-        <w:t>B</w:t>
-      </w:r>
-      <w:r>
-        <w:t>)</w:t>
-      </w:r>
-      <w:r>
-        <w:t>(</w:t>
-      </w:r>
-      <w:proofErr w:type="gramEnd"/>
-      <w:r>
-        <w:t xml:space="preserve">A </w:t>
-      </w:r>
-      <w:r>
-        <w:rPr>
-          <w:rFonts w:ascii="Cambria Math" w:hAnsi="Cambria Math" w:cs="Cambria Math"/>
-        </w:rPr>
-        <w:t>+</w:t>
-      </w:r>
-      <w:r>
-        <w:t xml:space="preserve"> C)</w:t>
-      </w:r>
-      <w:r>
-        <w:t>.</w:t>
+        <w:t xml:space="preserve"> C).</w:t>
       </w:r>
     </w:p>
     <w:p>
@@ -2520,14 +2374,7 @@
                 <w:rFonts w:ascii="Cambria Math" w:hAnsi="Cambria Math"/>
                 <w:lang w:val="en-US"/>
               </w:rPr>
-              <m:t>A</m:t>
-            </m:r>
-            <m:r>
-              <w:rPr>
-                <w:rFonts w:ascii="Cambria Math" w:hAnsi="Cambria Math"/>
-                <w:lang w:val="en-US"/>
-              </w:rPr>
-              <m:t>+B</m:t>
+              <m:t>A+B</m:t>
             </m:r>
           </m:e>
         </m:acc>
@@ -2667,43 +2514,7 @@
       </w:pPr>
       <w:r>
         <w:lastRenderedPageBreak/>
-        <w:t>Encontre um</w:t>
-      </w:r>
-      <w:r>
-        <w:t>a expressão</w:t>
-      </w:r>
-      <w:r>
-        <w:t xml:space="preserve"> boolean</w:t>
-      </w:r>
-      <w:r>
-        <w:t>a</w:t>
-      </w:r>
-      <w:r>
-        <w:t xml:space="preserve"> </w:t>
-      </w:r>
-      <w:r>
-        <w:t xml:space="preserve">para </w:t>
-      </w:r>
-      <w:r>
-        <w:t xml:space="preserve">as variáveis ​​booleanas </w:t>
-      </w:r>
-      <w:r>
-        <w:t>A</w:t>
-      </w:r>
-      <w:r>
-        <w:t xml:space="preserve">, </w:t>
-      </w:r>
-      <w:r>
-        <w:t>B</w:t>
-      </w:r>
-      <w:r>
-        <w:t xml:space="preserve"> e</w:t>
-      </w:r>
-      <w:r>
-        <w:t xml:space="preserve"> C, de modo que o valor de saída seja</w:t>
-      </w:r>
-      <w:r>
-        <w:t xml:space="preserve"> 1 se, e somente se:</w:t>
+        <w:t>Encontre uma expressão booleana para as variáveis ​​booleanas A, B e C, de modo que o valor de saída seja 1 se, e somente se:</w:t>
       </w:r>
     </w:p>
     <w:p>
@@ -2723,22 +2534,7 @@
         <w:jc w:val="both"/>
       </w:pPr>
       <w:r>
-        <w:t>A</w:t>
-      </w:r>
-      <w:r>
-        <w:t xml:space="preserve"> = </w:t>
-      </w:r>
-      <w:r>
-        <w:t>B</w:t>
-      </w:r>
-      <w:r>
-        <w:t xml:space="preserve"> = 0, </w:t>
-      </w:r>
-      <w:r>
-        <w:t>C</w:t>
-      </w:r>
-      <w:r>
-        <w:t xml:space="preserve"> = 1. </w:t>
+        <w:t xml:space="preserve">A = B = 0, C = 1. </w:t>
       </w:r>
     </w:p>
     <w:p>
@@ -2752,22 +2548,7 @@
         <w:jc w:val="both"/>
       </w:pPr>
       <w:r>
-        <w:t>A</w:t>
-      </w:r>
-      <w:r>
-        <w:t xml:space="preserve"> = 0, </w:t>
-      </w:r>
-      <w:r>
-        <w:t>B</w:t>
-      </w:r>
-      <w:r>
-        <w:t xml:space="preserve"> = 1, </w:t>
-      </w:r>
-      <w:r>
-        <w:t>C</w:t>
-      </w:r>
-      <w:r>
-        <w:t xml:space="preserve"> = 0.</w:t>
+        <w:t>A = 0, B = 1, C = 0.</w:t>
       </w:r>
     </w:p>
     <w:p>
@@ -2781,22 +2562,7 @@
         <w:jc w:val="both"/>
       </w:pPr>
       <w:r>
-        <w:t>A</w:t>
-      </w:r>
-      <w:r>
-        <w:t xml:space="preserve"> = 0, </w:t>
-      </w:r>
-      <w:r>
-        <w:t>B</w:t>
-      </w:r>
-      <w:r>
-        <w:t xml:space="preserve"> = </w:t>
-      </w:r>
-      <w:r>
-        <w:t>C</w:t>
-      </w:r>
-      <w:r>
-        <w:t xml:space="preserve"> = 1. </w:t>
+        <w:t xml:space="preserve">A = 0, B = C = 1. </w:t>
       </w:r>
     </w:p>
     <w:p>
@@ -2810,22 +2576,7 @@
         <w:jc w:val="both"/>
       </w:pPr>
       <w:r>
-        <w:t>A</w:t>
-      </w:r>
-      <w:r>
-        <w:t xml:space="preserve"> = </w:t>
-      </w:r>
-      <w:r>
-        <w:t>B</w:t>
-      </w:r>
-      <w:r>
-        <w:t xml:space="preserve"> = </w:t>
-      </w:r>
-      <w:r>
-        <w:t>C</w:t>
-      </w:r>
-      <w:r>
-        <w:t xml:space="preserve"> = 0.</w:t>
+        <w:t>A = B = C = 0.</w:t>
       </w:r>
     </w:p>
     <w:p>
@@ -2937,10 +2688,7 @@
         </m:acc>
       </m:oMath>
       <w:r>
-        <w:t xml:space="preserve"> </w:t>
-      </w:r>
-      <w:r>
-        <w:t>(</w:t>
+        <w:t xml:space="preserve"> (</w:t>
       </w:r>
       <m:oMath>
         <m:acc>
@@ -3003,14 +2751,7 @@
                 <w:rFonts w:ascii="Cambria Math" w:hAnsi="Cambria Math"/>
                 <w:lang w:val="en-US"/>
               </w:rPr>
-              <m:t>A</m:t>
-            </m:r>
-            <m:r>
-              <w:rPr>
-                <w:rFonts w:ascii="Cambria Math" w:hAnsi="Cambria Math"/>
-                <w:lang w:val="en-US"/>
-              </w:rPr>
-              <m:t>+</m:t>
+              <m:t>A+</m:t>
             </m:r>
             <m:acc>
               <m:accPr>
@@ -3071,10 +2812,7 @@
         </m:acc>
       </m:oMath>
       <w:r>
-        <w:t xml:space="preserve"> </w:t>
-      </w:r>
-      <w:r>
-        <w:t>(</w:t>
+        <w:t xml:space="preserve"> (</w:t>
       </w:r>
       <w:r>
         <w:t>A</w:t>
@@ -3189,6 +2927,9 @@
         <w:jc w:val="both"/>
       </w:pPr>
       <w:r>
+        <w:rPr>
+          <w:noProof/>
+        </w:rPr>
         <w:drawing>
           <wp:inline distT="0" distB="0" distL="0" distR="0" wp14:anchorId="14839199" wp14:editId="7377EEF7">
             <wp:extent cx="1772943" cy="1397992"/>
@@ -3246,6 +2987,9 @@
         <w:jc w:val="both"/>
       </w:pPr>
       <w:r>
+        <w:rPr>
+          <w:noProof/>
+        </w:rPr>
         <w:drawing>
           <wp:inline distT="0" distB="0" distL="0" distR="0" wp14:anchorId="2E656AA2" wp14:editId="6CBA5FD3">
             <wp:extent cx="1778000" cy="1393951"/>
@@ -3294,6 +3038,9 @@
         <w:jc w:val="both"/>
       </w:pPr>
       <w:r>
+        <w:rPr>
+          <w:noProof/>
+        </w:rPr>
         <w:drawing>
           <wp:inline distT="0" distB="0" distL="0" distR="0" wp14:anchorId="3F055EFC" wp14:editId="1B453E4E">
             <wp:extent cx="1778560" cy="1999397"/>
@@ -3342,6 +3089,9 @@
         <w:jc w:val="both"/>
       </w:pPr>
       <w:r>
+        <w:rPr>
+          <w:noProof/>
+        </w:rPr>
         <w:drawing>
           <wp:inline distT="0" distB="0" distL="0" distR="0" wp14:anchorId="3371C31F" wp14:editId="3A6877E5">
             <wp:extent cx="1743573" cy="1363325"/>
@@ -3390,6 +3140,9 @@
         <w:jc w:val="both"/>
       </w:pPr>
       <w:r>
+        <w:rPr>
+          <w:noProof/>
+        </w:rPr>
         <w:drawing>
           <wp:inline distT="0" distB="0" distL="0" distR="0" wp14:anchorId="13CBC25D" wp14:editId="75736938">
             <wp:extent cx="1739842" cy="1365036"/>
@@ -3438,6 +3191,9 @@
         <w:jc w:val="both"/>
       </w:pPr>
       <w:r>
+        <w:rPr>
+          <w:noProof/>
+        </w:rPr>
         <w:drawing>
           <wp:inline distT="0" distB="0" distL="0" distR="0" wp14:anchorId="26CE9B07" wp14:editId="4DDD6350">
             <wp:extent cx="1739265" cy="1950761"/>
@@ -3514,7 +3270,10 @@
         <w:jc w:val="both"/>
       </w:pPr>
       <w:r>
-        <w:t>Simplifique as expressões encontradas no exercício 20</w:t>
+        <w:t xml:space="preserve">Simplifique as expressões encontradas no exercício </w:t>
+      </w:r>
+      <w:r>
+        <w:t>18</w:t>
       </w:r>
       <w:r>
         <w:t>.</w:t>
@@ -3845,14 +3604,7 @@
             <w:rFonts w:ascii="Cambria Math" w:hAnsi="Cambria Math"/>
             <w:lang w:val="en-US"/>
           </w:rPr>
-          <m:t>D</m:t>
-        </m:r>
-        <m:r>
-          <w:rPr>
-            <w:rFonts w:ascii="Cambria Math" w:hAnsi="Cambria Math"/>
-            <w:lang w:val="en-US"/>
-          </w:rPr>
-          <m:t>+</m:t>
+          <m:t>D+</m:t>
         </m:r>
         <m:acc>
           <m:accPr>
@@ -4363,13 +4115,7 @@
           <w:rPr>
             <w:rFonts w:ascii="Cambria Math" w:hAnsi="Cambria Math"/>
           </w:rPr>
-          <m:t>·</m:t>
-        </m:r>
-        <m:r>
-          <w:rPr>
-            <w:rFonts w:ascii="Cambria Math" w:hAnsi="Cambria Math"/>
-          </w:rPr>
-          <m:t xml:space="preserve"> </m:t>
+          <m:t xml:space="preserve">· </m:t>
         </m:r>
         <m:acc>
           <m:accPr>
@@ -5461,10 +5207,13 @@
         <w:jc w:val="both"/>
       </w:pPr>
       <w:r>
-        <w:t>Desenhe a tabela-verdade para as expressões simplificadas do exercício 22</w:t>
-      </w:r>
-      <w:r>
-        <w:t xml:space="preserve"> (Sugiro fazer este exercício no </w:t>
+        <w:t xml:space="preserve">Desenhe a tabela-verdade para as expressões simplificadas do exercício </w:t>
+      </w:r>
+      <w:r>
+        <w:t xml:space="preserve">20 </w:t>
+      </w:r>
+      <w:r>
+        <w:t xml:space="preserve">(Sugiro fazer este exercício no </w:t>
       </w:r>
       <w:proofErr w:type="spellStart"/>
       <w:r>
@@ -7853,6 +7602,7 @@
   <w:style w:type="character" w:default="1" w:styleId="Fontepargpadro">
     <w:name w:val="Default Paragraph Font"/>
     <w:uiPriority w:val="1"/>
+    <w:semiHidden/>
     <w:unhideWhenUsed/>
   </w:style>
   <w:style w:type="table" w:default="1" w:styleId="Tabelanormal">

</xml_diff>